<commit_message>
docs: update spec and marketing docs with workflow-based navigation architecture
</commit_message>
<xml_diff>
--- a/docs/Thina_CRM_System_Specification_v0.11.0.docx
+++ b/docs/Thina_CRM_System_Specification_v0.11.0.docx
@@ -3709,7 +3709,7 @@
                 <w:sz w:val="20"/>
                 <w:szCs w:val="20"/>
               </w:rPr>
-              <w:t xml:space="preserve">Dark achromatic 240px sidebar (hidden on mobile, lg:flex) with CommandTrigger search bar, navigation links with indigo active indicator, and theme toggle</w:t>
+              <w:t xml:space="preserve">240px sidebar with grouped navigation (6 workflow groups: Overview, Prospecting, Pipeline, Listings, Transactions, Operations), CommandTrigger search bar, indigo active indicator, theme toggle, user profile</w:t>
             </w:r>
           </w:p>
         </w:tc>
@@ -3747,7 +3747,7 @@
                 <w:sz w:val="20"/>
                 <w:szCs w:val="20"/>
               </w:rPr>
-              <w:t xml:space="preserve">Fixed bottom navigation bar (5 items) with backdrop blur, visible on screens &lt; lg</w:t>
+              <w:t xml:space="preserve">Fixed bottom tab bar (4 items + More) with slide-up menu showing all grouped navigation, visible on screens &lt; lg</w:t>
             </w:r>
           </w:p>
         </w:tc>
@@ -4343,8 +4343,26 @@
         <w:spacing w:after="120" w:before="300"/>
       </w:pPr>
       <w:r>
-        <w:t xml:space="preserve">5.1 Route Map</w:t>
-      </w:r>
+        <w:t xml:space="preserve">5.1 Navigation &amp; Workflow Architecture</w:t>
+      </w:r>
+    </w:p>
+    <w:p>
+      <w:pPr>
+        <w:spacing w:after="100"/>
+      </w:pPr>
+      <w:r>
+        <w:rPr>
+          <w:rFonts w:ascii="Aptos" w:cs="Aptos" w:eastAsia="Aptos" w:hAnsi="Aptos"/>
+          <w:sz w:val="22"/>
+          <w:szCs w:val="22"/>
+        </w:rPr>
+        <w:t xml:space="preserve">The application's navigation is organised into six workflow-based groups that follow the end-to-end real estate sales process. This structure guides agents through a natural progression: generate leads → work the pipeline → manage listings → close transactions → run the business.</w:t>
+      </w:r>
+    </w:p>
+    <w:p>
+      <w:pPr>
+        <w:spacing w:after="40"/>
+      </w:pPr>
     </w:p>
     <w:tbl>
       <w:tblPr>
@@ -4362,7 +4380,6 @@
         <w:gridCol w:w="100"/>
         <w:gridCol w:w="100"/>
         <w:gridCol w:w="100"/>
-        <w:gridCol w:w="100"/>
       </w:tblGrid>
       <w:tr>
         <w:trPr>
@@ -4370,7 +4387,7 @@
         </w:trPr>
         <w:tc>
           <w:tcPr>
-            <w:tcW w:type="pct" w:w="25%"/>
+            <w:tcW w:type="pct" w:w="33.333333333333336%"/>
             <w:shd w:fill="18181B" w:val="clear"/>
           </w:tcPr>
           <w:p>
@@ -4386,13 +4403,13 @@
                 <w:sz w:val="20"/>
                 <w:szCs w:val="20"/>
               </w:rPr>
-              <w:t xml:space="preserve">Route</w:t>
+              <w:t xml:space="preserve">Group</w:t>
             </w:r>
           </w:p>
         </w:tc>
         <w:tc>
           <w:tcPr>
-            <w:tcW w:type="pct" w:w="25%"/>
+            <w:tcW w:type="pct" w:w="33.333333333333336%"/>
             <w:shd w:fill="18181B" w:val="clear"/>
           </w:tcPr>
           <w:p>
@@ -4408,13 +4425,13 @@
                 <w:sz w:val="20"/>
                 <w:szCs w:val="20"/>
               </w:rPr>
-              <w:t xml:space="preserve">File</w:t>
+              <w:t xml:space="preserve">Purpose</w:t>
             </w:r>
           </w:p>
         </w:tc>
         <w:tc>
           <w:tcPr>
-            <w:tcW w:type="pct" w:w="25%"/>
+            <w:tcW w:type="pct" w:w="33.333333333333336%"/>
             <w:shd w:fill="18181B" w:val="clear"/>
           </w:tcPr>
           <w:p>
@@ -4430,13 +4447,287 @@
                 <w:sz w:val="20"/>
                 <w:szCs w:val="20"/>
               </w:rPr>
-              <w:t xml:space="preserve">Auth Required</w:t>
-            </w:r>
-          </w:p>
-        </w:tc>
+              <w:t xml:space="preserve">Pages</w:t>
+            </w:r>
+          </w:p>
+        </w:tc>
+      </w:tr>
+      <w:tr>
+        <w:tc>
+          <w:p>
+            <w:r>
+              <w:rPr>
+                <w:rFonts w:ascii="Aptos" w:cs="Aptos" w:eastAsia="Aptos" w:hAnsi="Aptos"/>
+                <w:sz w:val="20"/>
+                <w:szCs w:val="20"/>
+              </w:rPr>
+              <w:t xml:space="preserve">Overview</w:t>
+            </w:r>
+          </w:p>
+        </w:tc>
+        <w:tc>
+          <w:p>
+            <w:r>
+              <w:rPr>
+                <w:rFonts w:ascii="Aptos" w:cs="Aptos" w:eastAsia="Aptos" w:hAnsi="Aptos"/>
+                <w:sz w:val="20"/>
+                <w:szCs w:val="20"/>
+              </w:rPr>
+              <w:t xml:space="preserve">Command centre — daily snapshot of KPIs and agency health</w:t>
+            </w:r>
+          </w:p>
+        </w:tc>
+        <w:tc>
+          <w:p>
+            <w:r>
+              <w:rPr>
+                <w:rFonts w:ascii="Aptos" w:cs="Aptos" w:eastAsia="Aptos" w:hAnsi="Aptos"/>
+                <w:sz w:val="20"/>
+                <w:szCs w:val="20"/>
+              </w:rPr>
+              <w:t xml:space="preserve">Dashboard</w:t>
+            </w:r>
+          </w:p>
+        </w:tc>
+      </w:tr>
+      <w:tr>
+        <w:tc>
+          <w:p>
+            <w:r>
+              <w:rPr>
+                <w:rFonts w:ascii="Aptos" w:cs="Aptos" w:eastAsia="Aptos" w:hAnsi="Aptos"/>
+                <w:sz w:val="20"/>
+                <w:szCs w:val="20"/>
+              </w:rPr>
+              <w:t xml:space="preserve">Prospecting</w:t>
+            </w:r>
+          </w:p>
+        </w:tc>
+        <w:tc>
+          <w:p>
+            <w:r>
+              <w:rPr>
+                <w:rFonts w:ascii="Aptos" w:cs="Aptos" w:eastAsia="Aptos" w:hAnsi="Aptos"/>
+                <w:sz w:val="20"/>
+                <w:szCs w:val="20"/>
+              </w:rPr>
+              <w:t xml:space="preserve">Lead generation — capture, automate first response, measure source ROI</w:t>
+            </w:r>
+          </w:p>
+        </w:tc>
+        <w:tc>
+          <w:p>
+            <w:r>
+              <w:rPr>
+                <w:rFonts w:ascii="Aptos" w:cs="Aptos" w:eastAsia="Aptos" w:hAnsi="Aptos"/>
+                <w:sz w:val="20"/>
+                <w:szCs w:val="20"/>
+              </w:rPr>
+              <w:t xml:space="preserve">Inbound Leads, Show Days, Speed-to-Lead, Lead ROI</w:t>
+            </w:r>
+          </w:p>
+        </w:tc>
+      </w:tr>
+      <w:tr>
+        <w:tc>
+          <w:p>
+            <w:r>
+              <w:rPr>
+                <w:rFonts w:ascii="Aptos" w:cs="Aptos" w:eastAsia="Aptos" w:hAnsi="Aptos"/>
+                <w:sz w:val="20"/>
+                <w:szCs w:val="20"/>
+              </w:rPr>
+              <w:t xml:space="preserve">Pipeline</w:t>
+            </w:r>
+          </w:p>
+        </w:tc>
+        <w:tc>
+          <w:p>
+            <w:r>
+              <w:rPr>
+                <w:rFonts w:ascii="Aptos" w:cs="Aptos" w:eastAsia="Aptos" w:hAnsi="Aptos"/>
+                <w:sz w:val="20"/>
+                <w:szCs w:val="20"/>
+              </w:rPr>
+              <w:t xml:space="preserve">Working the deal — nurture, qualify, communicate, match buyers</w:t>
+            </w:r>
+          </w:p>
+        </w:tc>
+        <w:tc>
+          <w:p>
+            <w:r>
+              <w:rPr>
+                <w:rFonts w:ascii="Aptos" w:cs="Aptos" w:eastAsia="Aptos" w:hAnsi="Aptos"/>
+                <w:sz w:val="20"/>
+                <w:szCs w:val="20"/>
+              </w:rPr>
+              <w:t xml:space="preserve">Leads, Pipeline Board, Contacts, Buyer Match, Sequences, Messaging</w:t>
+            </w:r>
+          </w:p>
+        </w:tc>
+      </w:tr>
+      <w:tr>
+        <w:tc>
+          <w:p>
+            <w:r>
+              <w:rPr>
+                <w:rFonts w:ascii="Aptos" w:cs="Aptos" w:eastAsia="Aptos" w:hAnsi="Aptos"/>
+                <w:sz w:val="20"/>
+                <w:szCs w:val="20"/>
+              </w:rPr>
+              <w:t xml:space="preserve">Listings</w:t>
+            </w:r>
+          </w:p>
+        </w:tc>
+        <w:tc>
+          <w:p>
+            <w:r>
+              <w:rPr>
+                <w:rFonts w:ascii="Aptos" w:cs="Aptos" w:eastAsia="Aptos" w:hAnsi="Aptos"/>
+                <w:sz w:val="20"/>
+                <w:szCs w:val="20"/>
+              </w:rPr>
+              <w:t xml:space="preserve">Property inventory — manage mandates, specs, and listing status</w:t>
+            </w:r>
+          </w:p>
+        </w:tc>
+        <w:tc>
+          <w:p>
+            <w:r>
+              <w:rPr>
+                <w:rFonts w:ascii="Aptos" w:cs="Aptos" w:eastAsia="Aptos" w:hAnsi="Aptos"/>
+                <w:sz w:val="20"/>
+                <w:szCs w:val="20"/>
+              </w:rPr>
+              <w:t xml:space="preserve">Properties</w:t>
+            </w:r>
+          </w:p>
+        </w:tc>
+      </w:tr>
+      <w:tr>
+        <w:tc>
+          <w:p>
+            <w:r>
+              <w:rPr>
+                <w:rFonts w:ascii="Aptos" w:cs="Aptos" w:eastAsia="Aptos" w:hAnsi="Aptos"/>
+                <w:sz w:val="20"/>
+                <w:szCs w:val="20"/>
+              </w:rPr>
+              <w:t xml:space="preserve">Transactions</w:t>
+            </w:r>
+          </w:p>
+        </w:tc>
+        <w:tc>
+          <w:p>
+            <w:r>
+              <w:rPr>
+                <w:rFonts w:ascii="Aptos" w:cs="Aptos" w:eastAsia="Aptos" w:hAnsi="Aptos"/>
+                <w:sz w:val="20"/>
+                <w:szCs w:val="20"/>
+              </w:rPr>
+              <w:t xml:space="preserve">Closing the deal — OTP through commission, paperwork, FICA</w:t>
+            </w:r>
+          </w:p>
+        </w:tc>
+        <w:tc>
+          <w:p>
+            <w:r>
+              <w:rPr>
+                <w:rFonts w:ascii="Aptos" w:cs="Aptos" w:eastAsia="Aptos" w:hAnsi="Aptos"/>
+                <w:sz w:val="20"/>
+                <w:szCs w:val="20"/>
+              </w:rPr>
+              <w:t xml:space="preserve">Deals, Documents</w:t>
+            </w:r>
+          </w:p>
+        </w:tc>
+      </w:tr>
+      <w:tr>
+        <w:tc>
+          <w:p>
+            <w:r>
+              <w:rPr>
+                <w:rFonts w:ascii="Aptos" w:cs="Aptos" w:eastAsia="Aptos" w:hAnsi="Aptos"/>
+                <w:sz w:val="20"/>
+                <w:szCs w:val="20"/>
+              </w:rPr>
+              <w:t xml:space="preserve">Operations</w:t>
+            </w:r>
+          </w:p>
+        </w:tc>
+        <w:tc>
+          <w:p>
+            <w:r>
+              <w:rPr>
+                <w:rFonts w:ascii="Aptos" w:cs="Aptos" w:eastAsia="Aptos" w:hAnsi="Aptos"/>
+                <w:sz w:val="20"/>
+                <w:szCs w:val="20"/>
+              </w:rPr>
+              <w:t xml:space="preserve">Running the business — tasks, analytics, POPIA/FICA compliance</w:t>
+            </w:r>
+          </w:p>
+        </w:tc>
+        <w:tc>
+          <w:p>
+            <w:r>
+              <w:rPr>
+                <w:rFonts w:ascii="Aptos" w:cs="Aptos" w:eastAsia="Aptos" w:hAnsi="Aptos"/>
+                <w:sz w:val="20"/>
+                <w:szCs w:val="20"/>
+              </w:rPr>
+              <w:t xml:space="preserve">Tasks, Reports, Compliance</w:t>
+            </w:r>
+          </w:p>
+        </w:tc>
+      </w:tr>
+    </w:tbl>
+    <w:p>
+      <w:pPr>
+        <w:spacing w:after="40"/>
+      </w:pPr>
+    </w:p>
+    <w:p>
+      <w:pPr>
+        <w:pStyle w:val="Heading2"/>
+        <w:spacing w:after="120" w:before="300"/>
+      </w:pPr>
+      <w:r>
+        <w:t xml:space="preserve">5.2 Route Map</w:t>
+      </w:r>
+    </w:p>
+    <w:p>
+      <w:pPr>
+        <w:pStyle w:val="Heading3"/>
+        <w:spacing w:after="120" w:before="300"/>
+      </w:pPr>
+      <w:r>
+        <w:t xml:space="preserve">Overview</w:t>
+      </w:r>
+    </w:p>
+    <w:tbl>
+      <w:tblPr>
+        <w:tblW w:type="pct" w:w="100%"/>
+        <w:tblBorders>
+          <w:top w:val="single" w:color="auto" w:sz="4"/>
+          <w:left w:val="single" w:color="auto" w:sz="4"/>
+          <w:bottom w:val="single" w:color="auto" w:sz="4"/>
+          <w:right w:val="single" w:color="auto" w:sz="4"/>
+          <w:insideH w:val="single" w:color="auto" w:sz="4"/>
+          <w:insideV w:val="single" w:color="auto" w:sz="4"/>
+        </w:tblBorders>
+      </w:tblPr>
+      <w:tblGrid>
+        <w:gridCol w:w="100"/>
+        <w:gridCol w:w="100"/>
+        <w:gridCol w:w="100"/>
+      </w:tblGrid>
+      <w:tr>
+        <w:trPr>
+          <w:tblHeader/>
+        </w:trPr>
         <w:tc>
           <w:tcPr>
-            <w:tcW w:type="pct" w:w="25%"/>
+            <w:tcW w:type="pct" w:w="33.333333333333336%"/>
             <w:shd w:fill="18181B" w:val="clear"/>
           </w:tcPr>
           <w:p>
@@ -4452,6 +4743,50 @@
                 <w:sz w:val="20"/>
                 <w:szCs w:val="20"/>
               </w:rPr>
+              <w:t xml:space="preserve">Route</w:t>
+            </w:r>
+          </w:p>
+        </w:tc>
+        <w:tc>
+          <w:tcPr>
+            <w:tcW w:type="pct" w:w="33.333333333333336%"/>
+            <w:shd w:fill="18181B" w:val="clear"/>
+          </w:tcPr>
+          <w:p>
+            <w:pPr>
+              <w:jc w:val="left"/>
+            </w:pPr>
+            <w:r>
+              <w:rPr>
+                <w:rFonts w:ascii="Aptos" w:cs="Aptos" w:eastAsia="Aptos" w:hAnsi="Aptos"/>
+                <w:b/>
+                <w:bCs/>
+                <w:color w:val="FFFFFF"/>
+                <w:sz w:val="20"/>
+                <w:szCs w:val="20"/>
+              </w:rPr>
+              <w:t xml:space="preserve">File</w:t>
+            </w:r>
+          </w:p>
+        </w:tc>
+        <w:tc>
+          <w:tcPr>
+            <w:tcW w:type="pct" w:w="33.333333333333336%"/>
+            <w:shd w:fill="18181B" w:val="clear"/>
+          </w:tcPr>
+          <w:p>
+            <w:pPr>
+              <w:jc w:val="left"/>
+            </w:pPr>
+            <w:r>
+              <w:rPr>
+                <w:rFonts w:ascii="Aptos" w:cs="Aptos" w:eastAsia="Aptos" w:hAnsi="Aptos"/>
+                <w:b/>
+                <w:bCs/>
+                <w:color w:val="FFFFFF"/>
+                <w:sz w:val="20"/>
+                <w:szCs w:val="20"/>
+              </w:rPr>
               <w:t xml:space="preserve">Description</w:t>
             </w:r>
           </w:p>
@@ -4490,23 +4825,407 @@
                 <w:sz w:val="20"/>
                 <w:szCs w:val="20"/>
               </w:rPr>
-              <w:t xml:space="preserve">Yes</w:t>
-            </w:r>
-          </w:p>
-        </w:tc>
-        <w:tc>
-          <w:p>
-            <w:r>
-              <w:rPr>
-                <w:rFonts w:ascii="Aptos" w:cs="Aptos" w:eastAsia="Aptos" w:hAnsi="Aptos"/>
-                <w:sz w:val="20"/>
-                <w:szCs w:val="20"/>
-              </w:rPr>
               <w:t xml:space="preserve">Dashboard with KPIs, pipeline summary, forecast, recent activities, and top leads</w:t>
             </w:r>
           </w:p>
         </w:tc>
       </w:tr>
+    </w:tbl>
+    <w:p>
+      <w:pPr>
+        <w:spacing w:after="40"/>
+      </w:pPr>
+    </w:p>
+    <w:p>
+      <w:pPr>
+        <w:pStyle w:val="Heading3"/>
+        <w:spacing w:after="120" w:before="300"/>
+      </w:pPr>
+      <w:r>
+        <w:t xml:space="preserve">Prospecting</w:t>
+      </w:r>
+    </w:p>
+    <w:tbl>
+      <w:tblPr>
+        <w:tblW w:type="pct" w:w="100%"/>
+        <w:tblBorders>
+          <w:top w:val="single" w:color="auto" w:sz="4"/>
+          <w:left w:val="single" w:color="auto" w:sz="4"/>
+          <w:bottom w:val="single" w:color="auto" w:sz="4"/>
+          <w:right w:val="single" w:color="auto" w:sz="4"/>
+          <w:insideH w:val="single" w:color="auto" w:sz="4"/>
+          <w:insideV w:val="single" w:color="auto" w:sz="4"/>
+        </w:tblBorders>
+      </w:tblPr>
+      <w:tblGrid>
+        <w:gridCol w:w="100"/>
+        <w:gridCol w:w="100"/>
+        <w:gridCol w:w="100"/>
+      </w:tblGrid>
+      <w:tr>
+        <w:trPr>
+          <w:tblHeader/>
+        </w:trPr>
+        <w:tc>
+          <w:tcPr>
+            <w:tcW w:type="pct" w:w="33.333333333333336%"/>
+            <w:shd w:fill="18181B" w:val="clear"/>
+          </w:tcPr>
+          <w:p>
+            <w:pPr>
+              <w:jc w:val="left"/>
+            </w:pPr>
+            <w:r>
+              <w:rPr>
+                <w:rFonts w:ascii="Aptos" w:cs="Aptos" w:eastAsia="Aptos" w:hAnsi="Aptos"/>
+                <w:b/>
+                <w:bCs/>
+                <w:color w:val="FFFFFF"/>
+                <w:sz w:val="20"/>
+                <w:szCs w:val="20"/>
+              </w:rPr>
+              <w:t xml:space="preserve">Route</w:t>
+            </w:r>
+          </w:p>
+        </w:tc>
+        <w:tc>
+          <w:tcPr>
+            <w:tcW w:type="pct" w:w="33.333333333333336%"/>
+            <w:shd w:fill="18181B" w:val="clear"/>
+          </w:tcPr>
+          <w:p>
+            <w:pPr>
+              <w:jc w:val="left"/>
+            </w:pPr>
+            <w:r>
+              <w:rPr>
+                <w:rFonts w:ascii="Aptos" w:cs="Aptos" w:eastAsia="Aptos" w:hAnsi="Aptos"/>
+                <w:b/>
+                <w:bCs/>
+                <w:color w:val="FFFFFF"/>
+                <w:sz w:val="20"/>
+                <w:szCs w:val="20"/>
+              </w:rPr>
+              <w:t xml:space="preserve">File</w:t>
+            </w:r>
+          </w:p>
+        </w:tc>
+        <w:tc>
+          <w:tcPr>
+            <w:tcW w:type="pct" w:w="33.333333333333336%"/>
+            <w:shd w:fill="18181B" w:val="clear"/>
+          </w:tcPr>
+          <w:p>
+            <w:pPr>
+              <w:jc w:val="left"/>
+            </w:pPr>
+            <w:r>
+              <w:rPr>
+                <w:rFonts w:ascii="Aptos" w:cs="Aptos" w:eastAsia="Aptos" w:hAnsi="Aptos"/>
+                <w:b/>
+                <w:bCs/>
+                <w:color w:val="FFFFFF"/>
+                <w:sz w:val="20"/>
+                <w:szCs w:val="20"/>
+              </w:rPr>
+              <w:t xml:space="preserve">Description</w:t>
+            </w:r>
+          </w:p>
+        </w:tc>
+      </w:tr>
+      <w:tr>
+        <w:tc>
+          <w:p>
+            <w:r>
+              <w:rPr>
+                <w:rFonts w:ascii="Aptos" w:cs="Aptos" w:eastAsia="Aptos" w:hAnsi="Aptos"/>
+                <w:sz w:val="20"/>
+                <w:szCs w:val="20"/>
+              </w:rPr>
+              <w:t xml:space="preserve">/inbound</w:t>
+            </w:r>
+          </w:p>
+        </w:tc>
+        <w:tc>
+          <w:p>
+            <w:r>
+              <w:rPr>
+                <w:rFonts w:ascii="Aptos" w:cs="Aptos" w:eastAsia="Aptos" w:hAnsi="Aptos"/>
+                <w:sz w:val="20"/>
+                <w:szCs w:val="20"/>
+              </w:rPr>
+              <w:t xml:space="preserve">app/inbound/page.tsx</w:t>
+            </w:r>
+          </w:p>
+        </w:tc>
+        <w:tc>
+          <w:p>
+            <w:r>
+              <w:rPr>
+                <w:rFonts w:ascii="Aptos" w:cs="Aptos" w:eastAsia="Aptos" w:hAnsi="Aptos"/>
+                <w:sz w:val="20"/>
+                <w:szCs w:val="20"/>
+              </w:rPr>
+              <w:t xml:space="preserve">Inbound lead portal injection with email paste, filter tabs, and KPI cards</w:t>
+            </w:r>
+          </w:p>
+        </w:tc>
+      </w:tr>
+      <w:tr>
+        <w:tc>
+          <w:p>
+            <w:r>
+              <w:rPr>
+                <w:rFonts w:ascii="Aptos" w:cs="Aptos" w:eastAsia="Aptos" w:hAnsi="Aptos"/>
+                <w:sz w:val="20"/>
+                <w:szCs w:val="20"/>
+              </w:rPr>
+              <w:t xml:space="preserve">/showdays</w:t>
+            </w:r>
+          </w:p>
+        </w:tc>
+        <w:tc>
+          <w:p>
+            <w:r>
+              <w:rPr>
+                <w:rFonts w:ascii="Aptos" w:cs="Aptos" w:eastAsia="Aptos" w:hAnsi="Aptos"/>
+                <w:sz w:val="20"/>
+                <w:szCs w:val="20"/>
+              </w:rPr>
+              <w:t xml:space="preserve">app/showdays/page.tsx</w:t>
+            </w:r>
+          </w:p>
+        </w:tc>
+        <w:tc>
+          <w:p>
+            <w:r>
+              <w:rPr>
+                <w:rFonts w:ascii="Aptos" w:cs="Aptos" w:eastAsia="Aptos" w:hAnsi="Aptos"/>
+                <w:sz w:val="20"/>
+                <w:szCs w:val="20"/>
+              </w:rPr>
+              <w:t xml:space="preserve">Show day event management with KPI cards, scheduling, and lead capture</w:t>
+            </w:r>
+          </w:p>
+        </w:tc>
+      </w:tr>
+      <w:tr>
+        <w:tc>
+          <w:p>
+            <w:r>
+              <w:rPr>
+                <w:rFonts w:ascii="Aptos" w:cs="Aptos" w:eastAsia="Aptos" w:hAnsi="Aptos"/>
+                <w:sz w:val="20"/>
+                <w:szCs w:val="20"/>
+              </w:rPr>
+              <w:t xml:space="preserve">/showday/[id]</w:t>
+            </w:r>
+          </w:p>
+        </w:tc>
+        <w:tc>
+          <w:p>
+            <w:r>
+              <w:rPr>
+                <w:rFonts w:ascii="Aptos" w:cs="Aptos" w:eastAsia="Aptos" w:hAnsi="Aptos"/>
+                <w:sz w:val="20"/>
+                <w:szCs w:val="20"/>
+              </w:rPr>
+              <w:t xml:space="preserve">app/showday/[id]/page.tsx</w:t>
+            </w:r>
+          </w:p>
+        </w:tc>
+        <w:tc>
+          <w:p>
+            <w:r>
+              <w:rPr>
+                <w:rFonts w:ascii="Aptos" w:cs="Aptos" w:eastAsia="Aptos" w:hAnsi="Aptos"/>
+                <w:sz w:val="20"/>
+                <w:szCs w:val="20"/>
+              </w:rPr>
+              <w:t xml:space="preserve">Public show day registration form (QR code compatible, no auth required)</w:t>
+            </w:r>
+          </w:p>
+        </w:tc>
+      </w:tr>
+      <w:tr>
+        <w:tc>
+          <w:p>
+            <w:r>
+              <w:rPr>
+                <w:rFonts w:ascii="Aptos" w:cs="Aptos" w:eastAsia="Aptos" w:hAnsi="Aptos"/>
+                <w:sz w:val="20"/>
+                <w:szCs w:val="20"/>
+              </w:rPr>
+              <w:t xml:space="preserve">/speed-to-lead</w:t>
+            </w:r>
+          </w:p>
+        </w:tc>
+        <w:tc>
+          <w:p>
+            <w:r>
+              <w:rPr>
+                <w:rFonts w:ascii="Aptos" w:cs="Aptos" w:eastAsia="Aptos" w:hAnsi="Aptos"/>
+                <w:sz w:val="20"/>
+                <w:szCs w:val="20"/>
+              </w:rPr>
+              <w:t xml:space="preserve">app/speed-to-lead/page.tsx</w:t>
+            </w:r>
+          </w:p>
+        </w:tc>
+        <w:tc>
+          <w:p>
+            <w:r>
+              <w:rPr>
+                <w:rFonts w:ascii="Aptos" w:cs="Aptos" w:eastAsia="Aptos" w:hAnsi="Aptos"/>
+                <w:sz w:val="20"/>
+                <w:szCs w:val="20"/>
+              </w:rPr>
+              <w:t xml:space="preserve">Auto-response rule management with trigger configuration and conversion stats</w:t>
+            </w:r>
+          </w:p>
+        </w:tc>
+      </w:tr>
+      <w:tr>
+        <w:tc>
+          <w:p>
+            <w:r>
+              <w:rPr>
+                <w:rFonts w:ascii="Aptos" w:cs="Aptos" w:eastAsia="Aptos" w:hAnsi="Aptos"/>
+                <w:sz w:val="20"/>
+                <w:szCs w:val="20"/>
+              </w:rPr>
+              <w:t xml:space="preserve">/lead-roi</w:t>
+            </w:r>
+          </w:p>
+        </w:tc>
+        <w:tc>
+          <w:p>
+            <w:r>
+              <w:rPr>
+                <w:rFonts w:ascii="Aptos" w:cs="Aptos" w:eastAsia="Aptos" w:hAnsi="Aptos"/>
+                <w:sz w:val="20"/>
+                <w:szCs w:val="20"/>
+              </w:rPr>
+              <w:t xml:space="preserve">app/lead-roi/page.tsx</w:t>
+            </w:r>
+          </w:p>
+        </w:tc>
+        <w:tc>
+          <w:p>
+            <w:r>
+              <w:rPr>
+                <w:rFonts w:ascii="Aptos" w:cs="Aptos" w:eastAsia="Aptos" w:hAnsi="Aptos"/>
+                <w:sz w:val="20"/>
+                <w:szCs w:val="20"/>
+              </w:rPr>
+              <w:t xml:space="preserve">Lead source ROI analytics with source cost tracking and KPI cards</w:t>
+            </w:r>
+          </w:p>
+        </w:tc>
+      </w:tr>
+    </w:tbl>
+    <w:p>
+      <w:pPr>
+        <w:spacing w:after="40"/>
+      </w:pPr>
+    </w:p>
+    <w:p>
+      <w:pPr>
+        <w:pStyle w:val="Heading3"/>
+        <w:spacing w:after="120" w:before="300"/>
+      </w:pPr>
+      <w:r>
+        <w:t xml:space="preserve">Pipeline</w:t>
+      </w:r>
+    </w:p>
+    <w:tbl>
+      <w:tblPr>
+        <w:tblW w:type="pct" w:w="100%"/>
+        <w:tblBorders>
+          <w:top w:val="single" w:color="auto" w:sz="4"/>
+          <w:left w:val="single" w:color="auto" w:sz="4"/>
+          <w:bottom w:val="single" w:color="auto" w:sz="4"/>
+          <w:right w:val="single" w:color="auto" w:sz="4"/>
+          <w:insideH w:val="single" w:color="auto" w:sz="4"/>
+          <w:insideV w:val="single" w:color="auto" w:sz="4"/>
+        </w:tblBorders>
+      </w:tblPr>
+      <w:tblGrid>
+        <w:gridCol w:w="100"/>
+        <w:gridCol w:w="100"/>
+        <w:gridCol w:w="100"/>
+      </w:tblGrid>
+      <w:tr>
+        <w:trPr>
+          <w:tblHeader/>
+        </w:trPr>
+        <w:tc>
+          <w:tcPr>
+            <w:tcW w:type="pct" w:w="33.333333333333336%"/>
+            <w:shd w:fill="18181B" w:val="clear"/>
+          </w:tcPr>
+          <w:p>
+            <w:pPr>
+              <w:jc w:val="left"/>
+            </w:pPr>
+            <w:r>
+              <w:rPr>
+                <w:rFonts w:ascii="Aptos" w:cs="Aptos" w:eastAsia="Aptos" w:hAnsi="Aptos"/>
+                <w:b/>
+                <w:bCs/>
+                <w:color w:val="FFFFFF"/>
+                <w:sz w:val="20"/>
+                <w:szCs w:val="20"/>
+              </w:rPr>
+              <w:t xml:space="preserve">Route</w:t>
+            </w:r>
+          </w:p>
+        </w:tc>
+        <w:tc>
+          <w:tcPr>
+            <w:tcW w:type="pct" w:w="33.333333333333336%"/>
+            <w:shd w:fill="18181B" w:val="clear"/>
+          </w:tcPr>
+          <w:p>
+            <w:pPr>
+              <w:jc w:val="left"/>
+            </w:pPr>
+            <w:r>
+              <w:rPr>
+                <w:rFonts w:ascii="Aptos" w:cs="Aptos" w:eastAsia="Aptos" w:hAnsi="Aptos"/>
+                <w:b/>
+                <w:bCs/>
+                <w:color w:val="FFFFFF"/>
+                <w:sz w:val="20"/>
+                <w:szCs w:val="20"/>
+              </w:rPr>
+              <w:t xml:space="preserve">File</w:t>
+            </w:r>
+          </w:p>
+        </w:tc>
+        <w:tc>
+          <w:tcPr>
+            <w:tcW w:type="pct" w:w="33.333333333333336%"/>
+            <w:shd w:fill="18181B" w:val="clear"/>
+          </w:tcPr>
+          <w:p>
+            <w:pPr>
+              <w:jc w:val="left"/>
+            </w:pPr>
+            <w:r>
+              <w:rPr>
+                <w:rFonts w:ascii="Aptos" w:cs="Aptos" w:eastAsia="Aptos" w:hAnsi="Aptos"/>
+                <w:b/>
+                <w:bCs/>
+                <w:color w:val="FFFFFF"/>
+                <w:sz w:val="20"/>
+                <w:szCs w:val="20"/>
+              </w:rPr>
+              <w:t xml:space="preserve">Description</w:t>
+            </w:r>
+          </w:p>
+        </w:tc>
+      </w:tr>
       <w:tr>
         <w:tc>
           <w:p>
@@ -4540,18 +5259,6 @@
                 <w:sz w:val="20"/>
                 <w:szCs w:val="20"/>
               </w:rPr>
-              <w:t xml:space="preserve">Yes</w:t>
-            </w:r>
-          </w:p>
-        </w:tc>
-        <w:tc>
-          <w:p>
-            <w:r>
-              <w:rPr>
-                <w:rFonts w:ascii="Aptos" w:cs="Aptos" w:eastAsia="Aptos" w:hAnsi="Aptos"/>
-                <w:sz w:val="20"/>
-                <w:szCs w:val="20"/>
-              </w:rPr>
               <w:t xml:space="preserve">Leads list with search, status filters, sorting, and create/edit/delete actions</w:t>
             </w:r>
           </w:p>
@@ -4590,18 +5297,6 @@
                 <w:sz w:val="20"/>
                 <w:szCs w:val="20"/>
               </w:rPr>
-              <w:t xml:space="preserve">Yes</w:t>
-            </w:r>
-          </w:p>
-        </w:tc>
-        <w:tc>
-          <w:p>
-            <w:r>
-              <w:rPr>
-                <w:rFonts w:ascii="Aptos" w:cs="Aptos" w:eastAsia="Aptos" w:hAnsi="Aptos"/>
-                <w:sz w:val="20"/>
-                <w:szCs w:val="20"/>
-              </w:rPr>
               <w:t xml:space="preserve">Lead detail with 3-column layout — contact info, deal info, notes, activity timeline, task list</w:t>
             </w:r>
           </w:p>
@@ -4616,6 +5311,44 @@
                 <w:sz w:val="20"/>
                 <w:szCs w:val="20"/>
               </w:rPr>
+              <w:t xml:space="preserve">/pipeline</w:t>
+            </w:r>
+          </w:p>
+        </w:tc>
+        <w:tc>
+          <w:p>
+            <w:r>
+              <w:rPr>
+                <w:rFonts w:ascii="Aptos" w:cs="Aptos" w:eastAsia="Aptos" w:hAnsi="Aptos"/>
+                <w:sz w:val="20"/>
+                <w:szCs w:val="20"/>
+              </w:rPr>
+              <w:t xml:space="preserve">app/pipeline/page.tsx</w:t>
+            </w:r>
+          </w:p>
+        </w:tc>
+        <w:tc>
+          <w:p>
+            <w:r>
+              <w:rPr>
+                <w:rFonts w:ascii="Aptos" w:cs="Aptos" w:eastAsia="Aptos" w:hAnsi="Aptos"/>
+                <w:sz w:val="20"/>
+                <w:szCs w:val="20"/>
+              </w:rPr>
+              <w:t xml:space="preserve">Visual pipeline board with 6 stages (New → Won/Lost), responsive grid layout</w:t>
+            </w:r>
+          </w:p>
+        </w:tc>
+      </w:tr>
+      <w:tr>
+        <w:tc>
+          <w:p>
+            <w:r>
+              <w:rPr>
+                <w:rFonts w:ascii="Aptos" w:cs="Aptos" w:eastAsia="Aptos" w:hAnsi="Aptos"/>
+                <w:sz w:val="20"/>
+                <w:szCs w:val="20"/>
+              </w:rPr>
               <w:t xml:space="preserve">/contacts</w:t>
             </w:r>
           </w:p>
@@ -4640,18 +5373,6 @@
                 <w:sz w:val="20"/>
                 <w:szCs w:val="20"/>
               </w:rPr>
-              <w:t xml:space="preserve">Yes</w:t>
-            </w:r>
-          </w:p>
-        </w:tc>
-        <w:tc>
-          <w:p>
-            <w:r>
-              <w:rPr>
-                <w:rFonts w:ascii="Aptos" w:cs="Aptos" w:eastAsia="Aptos" w:hAnsi="Aptos"/>
-                <w:sz w:val="20"/>
-                <w:szCs w:val="20"/>
-              </w:rPr>
               <w:t xml:space="preserve">Contacts list with search, create/edit/delete actions</w:t>
             </w:r>
           </w:p>
@@ -4690,18 +5411,6 @@
                 <w:sz w:val="20"/>
                 <w:szCs w:val="20"/>
               </w:rPr>
-              <w:t xml:space="preserve">Yes</w:t>
-            </w:r>
-          </w:p>
-        </w:tc>
-        <w:tc>
-          <w:p>
-            <w:r>
-              <w:rPr>
-                <w:rFonts w:ascii="Aptos" w:cs="Aptos" w:eastAsia="Aptos" w:hAnsi="Aptos"/>
-                <w:sz w:val="20"/>
-                <w:szCs w:val="20"/>
-              </w:rPr>
               <w:t xml:space="preserve">Contact detail with linked leads, activities, and tasks</w:t>
             </w:r>
           </w:p>
@@ -4716,43 +5425,351 @@
                 <w:sz w:val="20"/>
                 <w:szCs w:val="20"/>
               </w:rPr>
-              <w:t xml:space="preserve">/pipeline</w:t>
-            </w:r>
-          </w:p>
-        </w:tc>
-        <w:tc>
-          <w:p>
-            <w:r>
-              <w:rPr>
-                <w:rFonts w:ascii="Aptos" w:cs="Aptos" w:eastAsia="Aptos" w:hAnsi="Aptos"/>
-                <w:sz w:val="20"/>
-                <w:szCs w:val="20"/>
-              </w:rPr>
-              <w:t xml:space="preserve">app/pipeline/page.tsx</w:t>
-            </w:r>
-          </w:p>
-        </w:tc>
-        <w:tc>
-          <w:p>
-            <w:r>
-              <w:rPr>
-                <w:rFonts w:ascii="Aptos" w:cs="Aptos" w:eastAsia="Aptos" w:hAnsi="Aptos"/>
-                <w:sz w:val="20"/>
-                <w:szCs w:val="20"/>
-              </w:rPr>
-              <w:t xml:space="preserve">Yes</w:t>
-            </w:r>
-          </w:p>
-        </w:tc>
-        <w:tc>
-          <w:p>
-            <w:r>
-              <w:rPr>
-                <w:rFonts w:ascii="Aptos" w:cs="Aptos" w:eastAsia="Aptos" w:hAnsi="Aptos"/>
-                <w:sz w:val="20"/>
-                <w:szCs w:val="20"/>
-              </w:rPr>
-              <w:t xml:space="preserve">Visual pipeline board with 6 stages (New → Won/Lost), responsive grid layout</w:t>
+              <w:t xml:space="preserve">/buyer-match</w:t>
+            </w:r>
+          </w:p>
+        </w:tc>
+        <w:tc>
+          <w:p>
+            <w:r>
+              <w:rPr>
+                <w:rFonts w:ascii="Aptos" w:cs="Aptos" w:eastAsia="Aptos" w:hAnsi="Aptos"/>
+                <w:sz w:val="20"/>
+                <w:szCs w:val="20"/>
+              </w:rPr>
+              <w:t xml:space="preserve">app/buyer-match/page.tsx</w:t>
+            </w:r>
+          </w:p>
+        </w:tc>
+        <w:tc>
+          <w:p>
+            <w:r>
+              <w:rPr>
+                <w:rFonts w:ascii="Aptos" w:cs="Aptos" w:eastAsia="Aptos" w:hAnsi="Aptos"/>
+                <w:sz w:val="20"/>
+                <w:szCs w:val="20"/>
+              </w:rPr>
+              <w:t xml:space="preserve">Buyer-property matching engine with buyer profile management and KPI cards</w:t>
+            </w:r>
+          </w:p>
+        </w:tc>
+      </w:tr>
+      <w:tr>
+        <w:tc>
+          <w:p>
+            <w:r>
+              <w:rPr>
+                <w:rFonts w:ascii="Aptos" w:cs="Aptos" w:eastAsia="Aptos" w:hAnsi="Aptos"/>
+                <w:sz w:val="20"/>
+                <w:szCs w:val="20"/>
+              </w:rPr>
+              <w:t xml:space="preserve">/sequences</w:t>
+            </w:r>
+          </w:p>
+        </w:tc>
+        <w:tc>
+          <w:p>
+            <w:r>
+              <w:rPr>
+                <w:rFonts w:ascii="Aptos" w:cs="Aptos" w:eastAsia="Aptos" w:hAnsi="Aptos"/>
+                <w:sz w:val="20"/>
+                <w:szCs w:val="20"/>
+              </w:rPr>
+              <w:t xml:space="preserve">app/sequences/page.tsx</w:t>
+            </w:r>
+          </w:p>
+        </w:tc>
+        <w:tc>
+          <w:p>
+            <w:r>
+              <w:rPr>
+                <w:rFonts w:ascii="Aptos" w:cs="Aptos" w:eastAsia="Aptos" w:hAnsi="Aptos"/>
+                <w:sz w:val="20"/>
+                <w:szCs w:val="20"/>
+              </w:rPr>
+              <w:t xml:space="preserve">Follow-up sequence builder with KPI cards, automated step configuration</w:t>
+            </w:r>
+          </w:p>
+        </w:tc>
+      </w:tr>
+      <w:tr>
+        <w:tc>
+          <w:p>
+            <w:r>
+              <w:rPr>
+                <w:rFonts w:ascii="Aptos" w:cs="Aptos" w:eastAsia="Aptos" w:hAnsi="Aptos"/>
+                <w:sz w:val="20"/>
+                <w:szCs w:val="20"/>
+              </w:rPr>
+              <w:t xml:space="preserve">/messaging</w:t>
+            </w:r>
+          </w:p>
+        </w:tc>
+        <w:tc>
+          <w:p>
+            <w:r>
+              <w:rPr>
+                <w:rFonts w:ascii="Aptos" w:cs="Aptos" w:eastAsia="Aptos" w:hAnsi="Aptos"/>
+                <w:sz w:val="20"/>
+                <w:szCs w:val="20"/>
+              </w:rPr>
+              <w:t xml:space="preserve">app/messaging/page.tsx</w:t>
+            </w:r>
+          </w:p>
+        </w:tc>
+        <w:tc>
+          <w:p>
+            <w:r>
+              <w:rPr>
+                <w:rFonts w:ascii="Aptos" w:cs="Aptos" w:eastAsia="Aptos" w:hAnsi="Aptos"/>
+                <w:sz w:val="20"/>
+                <w:szCs w:val="20"/>
+              </w:rPr>
+              <w:t xml:space="preserve">SMS messaging hub with compose sheet, gateway notice, and message history</w:t>
+            </w:r>
+          </w:p>
+        </w:tc>
+      </w:tr>
+    </w:tbl>
+    <w:p>
+      <w:pPr>
+        <w:spacing w:after="40"/>
+      </w:pPr>
+    </w:p>
+    <w:p>
+      <w:pPr>
+        <w:pStyle w:val="Heading3"/>
+        <w:spacing w:after="120" w:before="300"/>
+      </w:pPr>
+      <w:r>
+        <w:t xml:space="preserve">Listings</w:t>
+      </w:r>
+    </w:p>
+    <w:tbl>
+      <w:tblPr>
+        <w:tblW w:type="pct" w:w="100%"/>
+        <w:tblBorders>
+          <w:top w:val="single" w:color="auto" w:sz="4"/>
+          <w:left w:val="single" w:color="auto" w:sz="4"/>
+          <w:bottom w:val="single" w:color="auto" w:sz="4"/>
+          <w:right w:val="single" w:color="auto" w:sz="4"/>
+          <w:insideH w:val="single" w:color="auto" w:sz="4"/>
+          <w:insideV w:val="single" w:color="auto" w:sz="4"/>
+        </w:tblBorders>
+      </w:tblPr>
+      <w:tblGrid>
+        <w:gridCol w:w="100"/>
+        <w:gridCol w:w="100"/>
+        <w:gridCol w:w="100"/>
+      </w:tblGrid>
+      <w:tr>
+        <w:trPr>
+          <w:tblHeader/>
+        </w:trPr>
+        <w:tc>
+          <w:tcPr>
+            <w:tcW w:type="pct" w:w="33.333333333333336%"/>
+            <w:shd w:fill="18181B" w:val="clear"/>
+          </w:tcPr>
+          <w:p>
+            <w:pPr>
+              <w:jc w:val="left"/>
+            </w:pPr>
+            <w:r>
+              <w:rPr>
+                <w:rFonts w:ascii="Aptos" w:cs="Aptos" w:eastAsia="Aptos" w:hAnsi="Aptos"/>
+                <w:b/>
+                <w:bCs/>
+                <w:color w:val="FFFFFF"/>
+                <w:sz w:val="20"/>
+                <w:szCs w:val="20"/>
+              </w:rPr>
+              <w:t xml:space="preserve">Route</w:t>
+            </w:r>
+          </w:p>
+        </w:tc>
+        <w:tc>
+          <w:tcPr>
+            <w:tcW w:type="pct" w:w="33.333333333333336%"/>
+            <w:shd w:fill="18181B" w:val="clear"/>
+          </w:tcPr>
+          <w:p>
+            <w:pPr>
+              <w:jc w:val="left"/>
+            </w:pPr>
+            <w:r>
+              <w:rPr>
+                <w:rFonts w:ascii="Aptos" w:cs="Aptos" w:eastAsia="Aptos" w:hAnsi="Aptos"/>
+                <w:b/>
+                <w:bCs/>
+                <w:color w:val="FFFFFF"/>
+                <w:sz w:val="20"/>
+                <w:szCs w:val="20"/>
+              </w:rPr>
+              <w:t xml:space="preserve">File</w:t>
+            </w:r>
+          </w:p>
+        </w:tc>
+        <w:tc>
+          <w:tcPr>
+            <w:tcW w:type="pct" w:w="33.333333333333336%"/>
+            <w:shd w:fill="18181B" w:val="clear"/>
+          </w:tcPr>
+          <w:p>
+            <w:pPr>
+              <w:jc w:val="left"/>
+            </w:pPr>
+            <w:r>
+              <w:rPr>
+                <w:rFonts w:ascii="Aptos" w:cs="Aptos" w:eastAsia="Aptos" w:hAnsi="Aptos"/>
+                <w:b/>
+                <w:bCs/>
+                <w:color w:val="FFFFFF"/>
+                <w:sz w:val="20"/>
+                <w:szCs w:val="20"/>
+              </w:rPr>
+              <w:t xml:space="preserve">Description</w:t>
+            </w:r>
+          </w:p>
+        </w:tc>
+      </w:tr>
+      <w:tr>
+        <w:tc>
+          <w:p>
+            <w:r>
+              <w:rPr>
+                <w:rFonts w:ascii="Aptos" w:cs="Aptos" w:eastAsia="Aptos" w:hAnsi="Aptos"/>
+                <w:sz w:val="20"/>
+                <w:szCs w:val="20"/>
+              </w:rPr>
+              <w:t xml:space="preserve">/properties</w:t>
+            </w:r>
+          </w:p>
+        </w:tc>
+        <w:tc>
+          <w:p>
+            <w:r>
+              <w:rPr>
+                <w:rFonts w:ascii="Aptos" w:cs="Aptos" w:eastAsia="Aptos" w:hAnsi="Aptos"/>
+                <w:sz w:val="20"/>
+                <w:szCs w:val="20"/>
+              </w:rPr>
+              <w:t xml:space="preserve">app/properties/page.tsx</w:t>
+            </w:r>
+          </w:p>
+        </w:tc>
+        <w:tc>
+          <w:p>
+            <w:r>
+              <w:rPr>
+                <w:rFonts w:ascii="Aptos" w:cs="Aptos" w:eastAsia="Aptos" w:hAnsi="Aptos"/>
+                <w:sz w:val="20"/>
+                <w:szCs w:val="20"/>
+              </w:rPr>
+              <w:t xml:space="preserve">Property/mandate management with KPI cards, search, add/edit/delete</w:t>
+            </w:r>
+          </w:p>
+        </w:tc>
+      </w:tr>
+    </w:tbl>
+    <w:p>
+      <w:pPr>
+        <w:spacing w:after="40"/>
+      </w:pPr>
+    </w:p>
+    <w:p>
+      <w:pPr>
+        <w:pStyle w:val="Heading3"/>
+        <w:spacing w:after="120" w:before="300"/>
+      </w:pPr>
+      <w:r>
+        <w:t xml:space="preserve">Transactions</w:t>
+      </w:r>
+    </w:p>
+    <w:tbl>
+      <w:tblPr>
+        <w:tblW w:type="pct" w:w="100%"/>
+        <w:tblBorders>
+          <w:top w:val="single" w:color="auto" w:sz="4"/>
+          <w:left w:val="single" w:color="auto" w:sz="4"/>
+          <w:bottom w:val="single" w:color="auto" w:sz="4"/>
+          <w:right w:val="single" w:color="auto" w:sz="4"/>
+          <w:insideH w:val="single" w:color="auto" w:sz="4"/>
+          <w:insideV w:val="single" w:color="auto" w:sz="4"/>
+        </w:tblBorders>
+      </w:tblPr>
+      <w:tblGrid>
+        <w:gridCol w:w="100"/>
+        <w:gridCol w:w="100"/>
+        <w:gridCol w:w="100"/>
+      </w:tblGrid>
+      <w:tr>
+        <w:trPr>
+          <w:tblHeader/>
+        </w:trPr>
+        <w:tc>
+          <w:tcPr>
+            <w:tcW w:type="pct" w:w="33.333333333333336%"/>
+            <w:shd w:fill="18181B" w:val="clear"/>
+          </w:tcPr>
+          <w:p>
+            <w:pPr>
+              <w:jc w:val="left"/>
+            </w:pPr>
+            <w:r>
+              <w:rPr>
+                <w:rFonts w:ascii="Aptos" w:cs="Aptos" w:eastAsia="Aptos" w:hAnsi="Aptos"/>
+                <w:b/>
+                <w:bCs/>
+                <w:color w:val="FFFFFF"/>
+                <w:sz w:val="20"/>
+                <w:szCs w:val="20"/>
+              </w:rPr>
+              <w:t xml:space="preserve">Route</w:t>
+            </w:r>
+          </w:p>
+        </w:tc>
+        <w:tc>
+          <w:tcPr>
+            <w:tcW w:type="pct" w:w="33.333333333333336%"/>
+            <w:shd w:fill="18181B" w:val="clear"/>
+          </w:tcPr>
+          <w:p>
+            <w:pPr>
+              <w:jc w:val="left"/>
+            </w:pPr>
+            <w:r>
+              <w:rPr>
+                <w:rFonts w:ascii="Aptos" w:cs="Aptos" w:eastAsia="Aptos" w:hAnsi="Aptos"/>
+                <w:b/>
+                <w:bCs/>
+                <w:color w:val="FFFFFF"/>
+                <w:sz w:val="20"/>
+                <w:szCs w:val="20"/>
+              </w:rPr>
+              <w:t xml:space="preserve">File</w:t>
+            </w:r>
+          </w:p>
+        </w:tc>
+        <w:tc>
+          <w:tcPr>
+            <w:tcW w:type="pct" w:w="33.333333333333336%"/>
+            <w:shd w:fill="18181B" w:val="clear"/>
+          </w:tcPr>
+          <w:p>
+            <w:pPr>
+              <w:jc w:val="left"/>
+            </w:pPr>
+            <w:r>
+              <w:rPr>
+                <w:rFonts w:ascii="Aptos" w:cs="Aptos" w:eastAsia="Aptos" w:hAnsi="Aptos"/>
+                <w:b/>
+                <w:bCs/>
+                <w:color w:val="FFFFFF"/>
+                <w:sz w:val="20"/>
+                <w:szCs w:val="20"/>
+              </w:rPr>
+              <w:t xml:space="preserve">Description</w:t>
             </w:r>
           </w:p>
         </w:tc>
@@ -4790,18 +5807,6 @@
                 <w:sz w:val="20"/>
                 <w:szCs w:val="20"/>
               </w:rPr>
-              <w:t xml:space="preserve">Yes</w:t>
-            </w:r>
-          </w:p>
-        </w:tc>
-        <w:tc>
-          <w:p>
-            <w:r>
-              <w:rPr>
-                <w:rFonts w:ascii="Aptos" w:cs="Aptos" w:eastAsia="Aptos" w:hAnsi="Aptos"/>
-                <w:sz w:val="20"/>
-                <w:szCs w:val="20"/>
-              </w:rPr>
               <w:t xml:space="preserve">Transaction list with search, stage filters, commission tracking, and FICA status</w:t>
             </w:r>
           </w:p>
@@ -4840,18 +5845,6 @@
                 <w:sz w:val="20"/>
                 <w:szCs w:val="20"/>
               </w:rPr>
-              <w:t xml:space="preserve">Yes</w:t>
-            </w:r>
-          </w:p>
-        </w:tc>
-        <w:tc>
-          <w:p>
-            <w:r>
-              <w:rPr>
-                <w:rFonts w:ascii="Aptos" w:cs="Aptos" w:eastAsia="Aptos" w:hAnsi="Aptos"/>
-                <w:sz w:val="20"/>
-                <w:szCs w:val="20"/>
-              </w:rPr>
               <w:t xml:space="preserve">Transaction detail with stage timeline, commission calculator, FICA compliance, parties, dates, and stage history</w:t>
             </w:r>
           </w:p>
@@ -4890,18 +5883,6 @@
                 <w:sz w:val="20"/>
                 <w:szCs w:val="20"/>
               </w:rPr>
-              <w:t xml:space="preserve">Yes</w:t>
-            </w:r>
-          </w:p>
-        </w:tc>
-        <w:tc>
-          <w:p>
-            <w:r>
-              <w:rPr>
-                <w:rFonts w:ascii="Aptos" w:cs="Aptos" w:eastAsia="Aptos" w:hAnsi="Aptos"/>
-                <w:sz w:val="20"/>
-                <w:szCs w:val="20"/>
-              </w:rPr>
               <w:t xml:space="preserve">Transaction Kanban board with 9 stages (OTP Signed → Commission Paid), drag-and-drop</w:t>
             </w:r>
           </w:p>
@@ -4916,6 +5897,147 @@
                 <w:sz w:val="20"/>
                 <w:szCs w:val="20"/>
               </w:rPr>
+              <w:t xml:space="preserve">/documents</w:t>
+            </w:r>
+          </w:p>
+        </w:tc>
+        <w:tc>
+          <w:p>
+            <w:r>
+              <w:rPr>
+                <w:rFonts w:ascii="Aptos" w:cs="Aptos" w:eastAsia="Aptos" w:hAnsi="Aptos"/>
+                <w:sz w:val="20"/>
+                <w:szCs w:val="20"/>
+              </w:rPr>
+              <w:t xml:space="preserve">app/documents/page.tsx</w:t>
+            </w:r>
+          </w:p>
+        </w:tc>
+        <w:tc>
+          <w:p>
+            <w:r>
+              <w:rPr>
+                <w:rFonts w:ascii="Aptos" w:cs="Aptos" w:eastAsia="Aptos" w:hAnsi="Aptos"/>
+                <w:sz w:val="20"/>
+                <w:szCs w:val="20"/>
+              </w:rPr>
+              <w:t xml:space="preserve">Document management with upload sheet, storage notice, and KPI cards</w:t>
+            </w:r>
+          </w:p>
+        </w:tc>
+      </w:tr>
+    </w:tbl>
+    <w:p>
+      <w:pPr>
+        <w:spacing w:after="40"/>
+      </w:pPr>
+    </w:p>
+    <w:p>
+      <w:pPr>
+        <w:pStyle w:val="Heading3"/>
+        <w:spacing w:after="120" w:before="300"/>
+      </w:pPr>
+      <w:r>
+        <w:t xml:space="preserve">Operations</w:t>
+      </w:r>
+    </w:p>
+    <w:tbl>
+      <w:tblPr>
+        <w:tblW w:type="pct" w:w="100%"/>
+        <w:tblBorders>
+          <w:top w:val="single" w:color="auto" w:sz="4"/>
+          <w:left w:val="single" w:color="auto" w:sz="4"/>
+          <w:bottom w:val="single" w:color="auto" w:sz="4"/>
+          <w:right w:val="single" w:color="auto" w:sz="4"/>
+          <w:insideH w:val="single" w:color="auto" w:sz="4"/>
+          <w:insideV w:val="single" w:color="auto" w:sz="4"/>
+        </w:tblBorders>
+      </w:tblPr>
+      <w:tblGrid>
+        <w:gridCol w:w="100"/>
+        <w:gridCol w:w="100"/>
+        <w:gridCol w:w="100"/>
+      </w:tblGrid>
+      <w:tr>
+        <w:trPr>
+          <w:tblHeader/>
+        </w:trPr>
+        <w:tc>
+          <w:tcPr>
+            <w:tcW w:type="pct" w:w="33.333333333333336%"/>
+            <w:shd w:fill="18181B" w:val="clear"/>
+          </w:tcPr>
+          <w:p>
+            <w:pPr>
+              <w:jc w:val="left"/>
+            </w:pPr>
+            <w:r>
+              <w:rPr>
+                <w:rFonts w:ascii="Aptos" w:cs="Aptos" w:eastAsia="Aptos" w:hAnsi="Aptos"/>
+                <w:b/>
+                <w:bCs/>
+                <w:color w:val="FFFFFF"/>
+                <w:sz w:val="20"/>
+                <w:szCs w:val="20"/>
+              </w:rPr>
+              <w:t xml:space="preserve">Route</w:t>
+            </w:r>
+          </w:p>
+        </w:tc>
+        <w:tc>
+          <w:tcPr>
+            <w:tcW w:type="pct" w:w="33.333333333333336%"/>
+            <w:shd w:fill="18181B" w:val="clear"/>
+          </w:tcPr>
+          <w:p>
+            <w:pPr>
+              <w:jc w:val="left"/>
+            </w:pPr>
+            <w:r>
+              <w:rPr>
+                <w:rFonts w:ascii="Aptos" w:cs="Aptos" w:eastAsia="Aptos" w:hAnsi="Aptos"/>
+                <w:b/>
+                <w:bCs/>
+                <w:color w:val="FFFFFF"/>
+                <w:sz w:val="20"/>
+                <w:szCs w:val="20"/>
+              </w:rPr>
+              <w:t xml:space="preserve">File</w:t>
+            </w:r>
+          </w:p>
+        </w:tc>
+        <w:tc>
+          <w:tcPr>
+            <w:tcW w:type="pct" w:w="33.333333333333336%"/>
+            <w:shd w:fill="18181B" w:val="clear"/>
+          </w:tcPr>
+          <w:p>
+            <w:pPr>
+              <w:jc w:val="left"/>
+            </w:pPr>
+            <w:r>
+              <w:rPr>
+                <w:rFonts w:ascii="Aptos" w:cs="Aptos" w:eastAsia="Aptos" w:hAnsi="Aptos"/>
+                <w:b/>
+                <w:bCs/>
+                <w:color w:val="FFFFFF"/>
+                <w:sz w:val="20"/>
+                <w:szCs w:val="20"/>
+              </w:rPr>
+              <w:t xml:space="preserve">Description</w:t>
+            </w:r>
+          </w:p>
+        </w:tc>
+      </w:tr>
+      <w:tr>
+        <w:tc>
+          <w:p>
+            <w:r>
+              <w:rPr>
+                <w:rFonts w:ascii="Aptos" w:cs="Aptos" w:eastAsia="Aptos" w:hAnsi="Aptos"/>
+                <w:sz w:val="20"/>
+                <w:szCs w:val="20"/>
+              </w:rPr>
               <w:t xml:space="preserve">/tasks</w:t>
             </w:r>
           </w:p>
@@ -4940,18 +6062,6 @@
                 <w:sz w:val="20"/>
                 <w:szCs w:val="20"/>
               </w:rPr>
-              <w:t xml:space="preserve">Yes</w:t>
-            </w:r>
-          </w:p>
-        </w:tc>
-        <w:tc>
-          <w:p>
-            <w:r>
-              <w:rPr>
-                <w:rFonts w:ascii="Aptos" w:cs="Aptos" w:eastAsia="Aptos" w:hAnsi="Aptos"/>
-                <w:sz w:val="20"/>
-                <w:szCs w:val="20"/>
-              </w:rPr>
               <w:t xml:space="preserve">Task management with KPIs, status filters, priority indicators, and completion toggling</w:t>
             </w:r>
           </w:p>
@@ -4990,18 +6100,6 @@
                 <w:sz w:val="20"/>
                 <w:szCs w:val="20"/>
               </w:rPr>
-              <w:t xml:space="preserve">Yes</w:t>
-            </w:r>
-          </w:p>
-        </w:tc>
-        <w:tc>
-          <w:p>
-            <w:r>
-              <w:rPr>
-                <w:rFonts w:ascii="Aptos" w:cs="Aptos" w:eastAsia="Aptos" w:hAnsi="Aptos"/>
-                <w:sz w:val="20"/>
-                <w:szCs w:val="20"/>
-              </w:rPr>
               <w:t xml:space="preserve">Business reports with pipeline analytics, source analysis, and conversion metrics</w:t>
             </w:r>
           </w:p>
@@ -5016,6 +6114,147 @@
                 <w:sz w:val="20"/>
                 <w:szCs w:val="20"/>
               </w:rPr>
+              <w:t xml:space="preserve">/compliance</w:t>
+            </w:r>
+          </w:p>
+        </w:tc>
+        <w:tc>
+          <w:p>
+            <w:r>
+              <w:rPr>
+                <w:rFonts w:ascii="Aptos" w:cs="Aptos" w:eastAsia="Aptos" w:hAnsi="Aptos"/>
+                <w:sz w:val="20"/>
+                <w:szCs w:val="20"/>
+              </w:rPr>
+              <w:t xml:space="preserve">app/compliance/page.tsx</w:t>
+            </w:r>
+          </w:p>
+        </w:tc>
+        <w:tc>
+          <w:p>
+            <w:r>
+              <w:rPr>
+                <w:rFonts w:ascii="Aptos" w:cs="Aptos" w:eastAsia="Aptos" w:hAnsi="Aptos"/>
+                <w:sz w:val="20"/>
+                <w:szCs w:val="20"/>
+              </w:rPr>
+              <w:t xml:space="preserve">POPIA compliance and regulatory management with consent tracking and tabbed views</w:t>
+            </w:r>
+          </w:p>
+        </w:tc>
+      </w:tr>
+    </w:tbl>
+    <w:p>
+      <w:pPr>
+        <w:spacing w:after="40"/>
+      </w:pPr>
+    </w:p>
+    <w:p>
+      <w:pPr>
+        <w:pStyle w:val="Heading3"/>
+        <w:spacing w:after="120" w:before="300"/>
+      </w:pPr>
+      <w:r>
+        <w:t xml:space="preserve">System</w:t>
+      </w:r>
+    </w:p>
+    <w:tbl>
+      <w:tblPr>
+        <w:tblW w:type="pct" w:w="100%"/>
+        <w:tblBorders>
+          <w:top w:val="single" w:color="auto" w:sz="4"/>
+          <w:left w:val="single" w:color="auto" w:sz="4"/>
+          <w:bottom w:val="single" w:color="auto" w:sz="4"/>
+          <w:right w:val="single" w:color="auto" w:sz="4"/>
+          <w:insideH w:val="single" w:color="auto" w:sz="4"/>
+          <w:insideV w:val="single" w:color="auto" w:sz="4"/>
+        </w:tblBorders>
+      </w:tblPr>
+      <w:tblGrid>
+        <w:gridCol w:w="100"/>
+        <w:gridCol w:w="100"/>
+        <w:gridCol w:w="100"/>
+      </w:tblGrid>
+      <w:tr>
+        <w:trPr>
+          <w:tblHeader/>
+        </w:trPr>
+        <w:tc>
+          <w:tcPr>
+            <w:tcW w:type="pct" w:w="33.333333333333336%"/>
+            <w:shd w:fill="18181B" w:val="clear"/>
+          </w:tcPr>
+          <w:p>
+            <w:pPr>
+              <w:jc w:val="left"/>
+            </w:pPr>
+            <w:r>
+              <w:rPr>
+                <w:rFonts w:ascii="Aptos" w:cs="Aptos" w:eastAsia="Aptos" w:hAnsi="Aptos"/>
+                <w:b/>
+                <w:bCs/>
+                <w:color w:val="FFFFFF"/>
+                <w:sz w:val="20"/>
+                <w:szCs w:val="20"/>
+              </w:rPr>
+              <w:t xml:space="preserve">Route</w:t>
+            </w:r>
+          </w:p>
+        </w:tc>
+        <w:tc>
+          <w:tcPr>
+            <w:tcW w:type="pct" w:w="33.333333333333336%"/>
+            <w:shd w:fill="18181B" w:val="clear"/>
+          </w:tcPr>
+          <w:p>
+            <w:pPr>
+              <w:jc w:val="left"/>
+            </w:pPr>
+            <w:r>
+              <w:rPr>
+                <w:rFonts w:ascii="Aptos" w:cs="Aptos" w:eastAsia="Aptos" w:hAnsi="Aptos"/>
+                <w:b/>
+                <w:bCs/>
+                <w:color w:val="FFFFFF"/>
+                <w:sz w:val="20"/>
+                <w:szCs w:val="20"/>
+              </w:rPr>
+              <w:t xml:space="preserve">File</w:t>
+            </w:r>
+          </w:p>
+        </w:tc>
+        <w:tc>
+          <w:tcPr>
+            <w:tcW w:type="pct" w:w="33.333333333333336%"/>
+            <w:shd w:fill="18181B" w:val="clear"/>
+          </w:tcPr>
+          <w:p>
+            <w:pPr>
+              <w:jc w:val="left"/>
+            </w:pPr>
+            <w:r>
+              <w:rPr>
+                <w:rFonts w:ascii="Aptos" w:cs="Aptos" w:eastAsia="Aptos" w:hAnsi="Aptos"/>
+                <w:b/>
+                <w:bCs/>
+                <w:color w:val="FFFFFF"/>
+                <w:sz w:val="20"/>
+                <w:szCs w:val="20"/>
+              </w:rPr>
+              <w:t xml:space="preserve">Description</w:t>
+            </w:r>
+          </w:p>
+        </w:tc>
+      </w:tr>
+      <w:tr>
+        <w:tc>
+          <w:p>
+            <w:r>
+              <w:rPr>
+                <w:rFonts w:ascii="Aptos" w:cs="Aptos" w:eastAsia="Aptos" w:hAnsi="Aptos"/>
+                <w:sz w:val="20"/>
+                <w:szCs w:val="20"/>
+              </w:rPr>
               <w:t xml:space="preserve">/login</w:t>
             </w:r>
           </w:p>
@@ -5040,18 +6279,6 @@
                 <w:sz w:val="20"/>
                 <w:szCs w:val="20"/>
               </w:rPr>
-              <w:t xml:space="preserve">No</w:t>
-            </w:r>
-          </w:p>
-        </w:tc>
-        <w:tc>
-          <w:p>
-            <w:r>
-              <w:rPr>
-                <w:rFonts w:ascii="Aptos" w:cs="Aptos" w:eastAsia="Aptos" w:hAnsi="Aptos"/>
-                <w:sz w:val="20"/>
-                <w:szCs w:val="20"/>
-              </w:rPr>
               <w:t xml:space="preserve">Authentication page with Google OAuth and email/password sign-in</w:t>
             </w:r>
           </w:p>
@@ -5090,569 +6317,7 @@
                 <w:sz w:val="20"/>
                 <w:szCs w:val="20"/>
               </w:rPr>
-              <w:t xml:space="preserve">Yes</w:t>
-            </w:r>
-          </w:p>
-        </w:tc>
-        <w:tc>
-          <w:p>
-            <w:r>
-              <w:rPr>
-                <w:rFonts w:ascii="Aptos" w:cs="Aptos" w:eastAsia="Aptos" w:hAnsi="Aptos"/>
-                <w:sz w:val="20"/>
-                <w:szCs w:val="20"/>
-              </w:rPr>
               <w:t xml:space="preserve">Data seeding utility to generate 1,350 test records with progress tracking</w:t>
-            </w:r>
-          </w:p>
-        </w:tc>
-      </w:tr>
-      <w:tr>
-        <w:tc>
-          <w:p>
-            <w:r>
-              <w:rPr>
-                <w:rFonts w:ascii="Aptos" w:cs="Aptos" w:eastAsia="Aptos" w:hAnsi="Aptos"/>
-                <w:sz w:val="20"/>
-                <w:szCs w:val="20"/>
-              </w:rPr>
-              <w:t xml:space="preserve">/properties</w:t>
-            </w:r>
-          </w:p>
-        </w:tc>
-        <w:tc>
-          <w:p>
-            <w:r>
-              <w:rPr>
-                <w:rFonts w:ascii="Aptos" w:cs="Aptos" w:eastAsia="Aptos" w:hAnsi="Aptos"/>
-                <w:sz w:val="20"/>
-                <w:szCs w:val="20"/>
-              </w:rPr>
-              <w:t xml:space="preserve">app/properties/page.tsx</w:t>
-            </w:r>
-          </w:p>
-        </w:tc>
-        <w:tc>
-          <w:p>
-            <w:r>
-              <w:rPr>
-                <w:rFonts w:ascii="Aptos" w:cs="Aptos" w:eastAsia="Aptos" w:hAnsi="Aptos"/>
-                <w:sz w:val="20"/>
-                <w:szCs w:val="20"/>
-              </w:rPr>
-              <w:t xml:space="preserve">Yes</w:t>
-            </w:r>
-          </w:p>
-        </w:tc>
-        <w:tc>
-          <w:p>
-            <w:r>
-              <w:rPr>
-                <w:rFonts w:ascii="Aptos" w:cs="Aptos" w:eastAsia="Aptos" w:hAnsi="Aptos"/>
-                <w:sz w:val="20"/>
-                <w:szCs w:val="20"/>
-              </w:rPr>
-              <w:t xml:space="preserve">Property/mandate management with KPI cards, search, add/edit/delete</w:t>
-            </w:r>
-          </w:p>
-        </w:tc>
-      </w:tr>
-      <w:tr>
-        <w:tc>
-          <w:p>
-            <w:r>
-              <w:rPr>
-                <w:rFonts w:ascii="Aptos" w:cs="Aptos" w:eastAsia="Aptos" w:hAnsi="Aptos"/>
-                <w:sz w:val="20"/>
-                <w:szCs w:val="20"/>
-              </w:rPr>
-              <w:t xml:space="preserve">/showdays</w:t>
-            </w:r>
-          </w:p>
-        </w:tc>
-        <w:tc>
-          <w:p>
-            <w:r>
-              <w:rPr>
-                <w:rFonts w:ascii="Aptos" w:cs="Aptos" w:eastAsia="Aptos" w:hAnsi="Aptos"/>
-                <w:sz w:val="20"/>
-                <w:szCs w:val="20"/>
-              </w:rPr>
-              <w:t xml:space="preserve">app/showdays/page.tsx</w:t>
-            </w:r>
-          </w:p>
-        </w:tc>
-        <w:tc>
-          <w:p>
-            <w:r>
-              <w:rPr>
-                <w:rFonts w:ascii="Aptos" w:cs="Aptos" w:eastAsia="Aptos" w:hAnsi="Aptos"/>
-                <w:sz w:val="20"/>
-                <w:szCs w:val="20"/>
-              </w:rPr>
-              <w:t xml:space="preserve">Yes</w:t>
-            </w:r>
-          </w:p>
-        </w:tc>
-        <w:tc>
-          <w:p>
-            <w:r>
-              <w:rPr>
-                <w:rFonts w:ascii="Aptos" w:cs="Aptos" w:eastAsia="Aptos" w:hAnsi="Aptos"/>
-                <w:sz w:val="20"/>
-                <w:szCs w:val="20"/>
-              </w:rPr>
-              <w:t xml:space="preserve">Show day event management with KPI cards, scheduling, and lead capture</w:t>
-            </w:r>
-          </w:p>
-        </w:tc>
-      </w:tr>
-      <w:tr>
-        <w:tc>
-          <w:p>
-            <w:r>
-              <w:rPr>
-                <w:rFonts w:ascii="Aptos" w:cs="Aptos" w:eastAsia="Aptos" w:hAnsi="Aptos"/>
-                <w:sz w:val="20"/>
-                <w:szCs w:val="20"/>
-              </w:rPr>
-              <w:t xml:space="preserve">/showday</w:t>
-            </w:r>
-          </w:p>
-        </w:tc>
-        <w:tc>
-          <w:p>
-            <w:r>
-              <w:rPr>
-                <w:rFonts w:ascii="Aptos" w:cs="Aptos" w:eastAsia="Aptos" w:hAnsi="Aptos"/>
-                <w:sz w:val="20"/>
-                <w:szCs w:val="20"/>
-              </w:rPr>
-              <w:t xml:space="preserve">app/showday/page.tsx</w:t>
-            </w:r>
-          </w:p>
-        </w:tc>
-        <w:tc>
-          <w:p>
-            <w:r>
-              <w:rPr>
-                <w:rFonts w:ascii="Aptos" w:cs="Aptos" w:eastAsia="Aptos" w:hAnsi="Aptos"/>
-                <w:sz w:val="20"/>
-                <w:szCs w:val="20"/>
-              </w:rPr>
-              <w:t xml:space="preserve">Yes</w:t>
-            </w:r>
-          </w:p>
-        </w:tc>
-        <w:tc>
-          <w:p>
-            <w:r>
-              <w:rPr>
-                <w:rFonts w:ascii="Aptos" w:cs="Aptos" w:eastAsia="Aptos" w:hAnsi="Aptos"/>
-                <w:sz w:val="20"/>
-                <w:szCs w:val="20"/>
-              </w:rPr>
-              <w:t xml:space="preserve">Individual show day detail/registration view</w:t>
-            </w:r>
-          </w:p>
-        </w:tc>
-      </w:tr>
-      <w:tr>
-        <w:tc>
-          <w:p>
-            <w:r>
-              <w:rPr>
-                <w:rFonts w:ascii="Aptos" w:cs="Aptos" w:eastAsia="Aptos" w:hAnsi="Aptos"/>
-                <w:sz w:val="20"/>
-                <w:szCs w:val="20"/>
-              </w:rPr>
-              <w:t xml:space="preserve">/inbound</w:t>
-            </w:r>
-          </w:p>
-        </w:tc>
-        <w:tc>
-          <w:p>
-            <w:r>
-              <w:rPr>
-                <w:rFonts w:ascii="Aptos" w:cs="Aptos" w:eastAsia="Aptos" w:hAnsi="Aptos"/>
-                <w:sz w:val="20"/>
-                <w:szCs w:val="20"/>
-              </w:rPr>
-              <w:t xml:space="preserve">app/inbound/page.tsx</w:t>
-            </w:r>
-          </w:p>
-        </w:tc>
-        <w:tc>
-          <w:p>
-            <w:r>
-              <w:rPr>
-                <w:rFonts w:ascii="Aptos" w:cs="Aptos" w:eastAsia="Aptos" w:hAnsi="Aptos"/>
-                <w:sz w:val="20"/>
-                <w:szCs w:val="20"/>
-              </w:rPr>
-              <w:t xml:space="preserve">Yes</w:t>
-            </w:r>
-          </w:p>
-        </w:tc>
-        <w:tc>
-          <w:p>
-            <w:r>
-              <w:rPr>
-                <w:rFonts w:ascii="Aptos" w:cs="Aptos" w:eastAsia="Aptos" w:hAnsi="Aptos"/>
-                <w:sz w:val="20"/>
-                <w:szCs w:val="20"/>
-              </w:rPr>
-              <w:t xml:space="preserve">Inbound lead portal injection with email paste, filter tabs, and KPI cards</w:t>
-            </w:r>
-          </w:p>
-        </w:tc>
-      </w:tr>
-      <w:tr>
-        <w:tc>
-          <w:p>
-            <w:r>
-              <w:rPr>
-                <w:rFonts w:ascii="Aptos" w:cs="Aptos" w:eastAsia="Aptos" w:hAnsi="Aptos"/>
-                <w:sz w:val="20"/>
-                <w:szCs w:val="20"/>
-              </w:rPr>
-              <w:t xml:space="preserve">/messaging</w:t>
-            </w:r>
-          </w:p>
-        </w:tc>
-        <w:tc>
-          <w:p>
-            <w:r>
-              <w:rPr>
-                <w:rFonts w:ascii="Aptos" w:cs="Aptos" w:eastAsia="Aptos" w:hAnsi="Aptos"/>
-                <w:sz w:val="20"/>
-                <w:szCs w:val="20"/>
-              </w:rPr>
-              <w:t xml:space="preserve">app/messaging/page.tsx</w:t>
-            </w:r>
-          </w:p>
-        </w:tc>
-        <w:tc>
-          <w:p>
-            <w:r>
-              <w:rPr>
-                <w:rFonts w:ascii="Aptos" w:cs="Aptos" w:eastAsia="Aptos" w:hAnsi="Aptos"/>
-                <w:sz w:val="20"/>
-                <w:szCs w:val="20"/>
-              </w:rPr>
-              <w:t xml:space="preserve">Yes</w:t>
-            </w:r>
-          </w:p>
-        </w:tc>
-        <w:tc>
-          <w:p>
-            <w:r>
-              <w:rPr>
-                <w:rFonts w:ascii="Aptos" w:cs="Aptos" w:eastAsia="Aptos" w:hAnsi="Aptos"/>
-                <w:sz w:val="20"/>
-                <w:szCs w:val="20"/>
-              </w:rPr>
-              <w:t xml:space="preserve">SMS messaging hub with compose sheet, gateway notice, and message history</w:t>
-            </w:r>
-          </w:p>
-        </w:tc>
-      </w:tr>
-      <w:tr>
-        <w:tc>
-          <w:p>
-            <w:r>
-              <w:rPr>
-                <w:rFonts w:ascii="Aptos" w:cs="Aptos" w:eastAsia="Aptos" w:hAnsi="Aptos"/>
-                <w:sz w:val="20"/>
-                <w:szCs w:val="20"/>
-              </w:rPr>
-              <w:t xml:space="preserve">/sequences</w:t>
-            </w:r>
-          </w:p>
-        </w:tc>
-        <w:tc>
-          <w:p>
-            <w:r>
-              <w:rPr>
-                <w:rFonts w:ascii="Aptos" w:cs="Aptos" w:eastAsia="Aptos" w:hAnsi="Aptos"/>
-                <w:sz w:val="20"/>
-                <w:szCs w:val="20"/>
-              </w:rPr>
-              <w:t xml:space="preserve">app/sequences/page.tsx</w:t>
-            </w:r>
-          </w:p>
-        </w:tc>
-        <w:tc>
-          <w:p>
-            <w:r>
-              <w:rPr>
-                <w:rFonts w:ascii="Aptos" w:cs="Aptos" w:eastAsia="Aptos" w:hAnsi="Aptos"/>
-                <w:sz w:val="20"/>
-                <w:szCs w:val="20"/>
-              </w:rPr>
-              <w:t xml:space="preserve">Yes</w:t>
-            </w:r>
-          </w:p>
-        </w:tc>
-        <w:tc>
-          <w:p>
-            <w:r>
-              <w:rPr>
-                <w:rFonts w:ascii="Aptos" w:cs="Aptos" w:eastAsia="Aptos" w:hAnsi="Aptos"/>
-                <w:sz w:val="20"/>
-                <w:szCs w:val="20"/>
-              </w:rPr>
-              <w:t xml:space="preserve">Follow-up sequence builder with KPI cards, automated step configuration</w:t>
-            </w:r>
-          </w:p>
-        </w:tc>
-      </w:tr>
-      <w:tr>
-        <w:tc>
-          <w:p>
-            <w:r>
-              <w:rPr>
-                <w:rFonts w:ascii="Aptos" w:cs="Aptos" w:eastAsia="Aptos" w:hAnsi="Aptos"/>
-                <w:sz w:val="20"/>
-                <w:szCs w:val="20"/>
-              </w:rPr>
-              <w:t xml:space="preserve">/speed-to-lead</w:t>
-            </w:r>
-          </w:p>
-        </w:tc>
-        <w:tc>
-          <w:p>
-            <w:r>
-              <w:rPr>
-                <w:rFonts w:ascii="Aptos" w:cs="Aptos" w:eastAsia="Aptos" w:hAnsi="Aptos"/>
-                <w:sz w:val="20"/>
-                <w:szCs w:val="20"/>
-              </w:rPr>
-              <w:t xml:space="preserve">app/speed-to-lead/page.tsx</w:t>
-            </w:r>
-          </w:p>
-        </w:tc>
-        <w:tc>
-          <w:p>
-            <w:r>
-              <w:rPr>
-                <w:rFonts w:ascii="Aptos" w:cs="Aptos" w:eastAsia="Aptos" w:hAnsi="Aptos"/>
-                <w:sz w:val="20"/>
-                <w:szCs w:val="20"/>
-              </w:rPr>
-              <w:t xml:space="preserve">Yes</w:t>
-            </w:r>
-          </w:p>
-        </w:tc>
-        <w:tc>
-          <w:p>
-            <w:r>
-              <w:rPr>
-                <w:rFonts w:ascii="Aptos" w:cs="Aptos" w:eastAsia="Aptos" w:hAnsi="Aptos"/>
-                <w:sz w:val="20"/>
-                <w:szCs w:val="20"/>
-              </w:rPr>
-              <w:t xml:space="preserve">Auto-response rule management with trigger configuration and conversion stats</w:t>
-            </w:r>
-          </w:p>
-        </w:tc>
-      </w:tr>
-      <w:tr>
-        <w:tc>
-          <w:p>
-            <w:r>
-              <w:rPr>
-                <w:rFonts w:ascii="Aptos" w:cs="Aptos" w:eastAsia="Aptos" w:hAnsi="Aptos"/>
-                <w:sz w:val="20"/>
-                <w:szCs w:val="20"/>
-              </w:rPr>
-              <w:t xml:space="preserve">/buyer-match</w:t>
-            </w:r>
-          </w:p>
-        </w:tc>
-        <w:tc>
-          <w:p>
-            <w:r>
-              <w:rPr>
-                <w:rFonts w:ascii="Aptos" w:cs="Aptos" w:eastAsia="Aptos" w:hAnsi="Aptos"/>
-                <w:sz w:val="20"/>
-                <w:szCs w:val="20"/>
-              </w:rPr>
-              <w:t xml:space="preserve">app/buyer-match/page.tsx</w:t>
-            </w:r>
-          </w:p>
-        </w:tc>
-        <w:tc>
-          <w:p>
-            <w:r>
-              <w:rPr>
-                <w:rFonts w:ascii="Aptos" w:cs="Aptos" w:eastAsia="Aptos" w:hAnsi="Aptos"/>
-                <w:sz w:val="20"/>
-                <w:szCs w:val="20"/>
-              </w:rPr>
-              <w:t xml:space="preserve">Yes</w:t>
-            </w:r>
-          </w:p>
-        </w:tc>
-        <w:tc>
-          <w:p>
-            <w:r>
-              <w:rPr>
-                <w:rFonts w:ascii="Aptos" w:cs="Aptos" w:eastAsia="Aptos" w:hAnsi="Aptos"/>
-                <w:sz w:val="20"/>
-                <w:szCs w:val="20"/>
-              </w:rPr>
-              <w:t xml:space="preserve">Buyer-property matching engine with buyer profile management and KPI cards</w:t>
-            </w:r>
-          </w:p>
-        </w:tc>
-      </w:tr>
-      <w:tr>
-        <w:tc>
-          <w:p>
-            <w:r>
-              <w:rPr>
-                <w:rFonts w:ascii="Aptos" w:cs="Aptos" w:eastAsia="Aptos" w:hAnsi="Aptos"/>
-                <w:sz w:val="20"/>
-                <w:szCs w:val="20"/>
-              </w:rPr>
-              <w:t xml:space="preserve">/documents</w:t>
-            </w:r>
-          </w:p>
-        </w:tc>
-        <w:tc>
-          <w:p>
-            <w:r>
-              <w:rPr>
-                <w:rFonts w:ascii="Aptos" w:cs="Aptos" w:eastAsia="Aptos" w:hAnsi="Aptos"/>
-                <w:sz w:val="20"/>
-                <w:szCs w:val="20"/>
-              </w:rPr>
-              <w:t xml:space="preserve">app/documents/page.tsx</w:t>
-            </w:r>
-          </w:p>
-        </w:tc>
-        <w:tc>
-          <w:p>
-            <w:r>
-              <w:rPr>
-                <w:rFonts w:ascii="Aptos" w:cs="Aptos" w:eastAsia="Aptos" w:hAnsi="Aptos"/>
-                <w:sz w:val="20"/>
-                <w:szCs w:val="20"/>
-              </w:rPr>
-              <w:t xml:space="preserve">Yes</w:t>
-            </w:r>
-          </w:p>
-        </w:tc>
-        <w:tc>
-          <w:p>
-            <w:r>
-              <w:rPr>
-                <w:rFonts w:ascii="Aptos" w:cs="Aptos" w:eastAsia="Aptos" w:hAnsi="Aptos"/>
-                <w:sz w:val="20"/>
-                <w:szCs w:val="20"/>
-              </w:rPr>
-              <w:t xml:space="preserve">Document management with upload sheet, storage notice, and KPI cards</w:t>
-            </w:r>
-          </w:p>
-        </w:tc>
-      </w:tr>
-      <w:tr>
-        <w:tc>
-          <w:p>
-            <w:r>
-              <w:rPr>
-                <w:rFonts w:ascii="Aptos" w:cs="Aptos" w:eastAsia="Aptos" w:hAnsi="Aptos"/>
-                <w:sz w:val="20"/>
-                <w:szCs w:val="20"/>
-              </w:rPr>
-              <w:t xml:space="preserve">/lead-roi</w:t>
-            </w:r>
-          </w:p>
-        </w:tc>
-        <w:tc>
-          <w:p>
-            <w:r>
-              <w:rPr>
-                <w:rFonts w:ascii="Aptos" w:cs="Aptos" w:eastAsia="Aptos" w:hAnsi="Aptos"/>
-                <w:sz w:val="20"/>
-                <w:szCs w:val="20"/>
-              </w:rPr>
-              <w:t xml:space="preserve">app/lead-roi/page.tsx</w:t>
-            </w:r>
-          </w:p>
-        </w:tc>
-        <w:tc>
-          <w:p>
-            <w:r>
-              <w:rPr>
-                <w:rFonts w:ascii="Aptos" w:cs="Aptos" w:eastAsia="Aptos" w:hAnsi="Aptos"/>
-                <w:sz w:val="20"/>
-                <w:szCs w:val="20"/>
-              </w:rPr>
-              <w:t xml:space="preserve">Yes</w:t>
-            </w:r>
-          </w:p>
-        </w:tc>
-        <w:tc>
-          <w:p>
-            <w:r>
-              <w:rPr>
-                <w:rFonts w:ascii="Aptos" w:cs="Aptos" w:eastAsia="Aptos" w:hAnsi="Aptos"/>
-                <w:sz w:val="20"/>
-                <w:szCs w:val="20"/>
-              </w:rPr>
-              <w:t xml:space="preserve">Lead source ROI analytics with source cost tracking and KPI cards</w:t>
-            </w:r>
-          </w:p>
-        </w:tc>
-      </w:tr>
-      <w:tr>
-        <w:tc>
-          <w:p>
-            <w:r>
-              <w:rPr>
-                <w:rFonts w:ascii="Aptos" w:cs="Aptos" w:eastAsia="Aptos" w:hAnsi="Aptos"/>
-                <w:sz w:val="20"/>
-                <w:szCs w:val="20"/>
-              </w:rPr>
-              <w:t xml:space="preserve">/compliance</w:t>
-            </w:r>
-          </w:p>
-        </w:tc>
-        <w:tc>
-          <w:p>
-            <w:r>
-              <w:rPr>
-                <w:rFonts w:ascii="Aptos" w:cs="Aptos" w:eastAsia="Aptos" w:hAnsi="Aptos"/>
-                <w:sz w:val="20"/>
-                <w:szCs w:val="20"/>
-              </w:rPr>
-              <w:t xml:space="preserve">app/compliance/page.tsx</w:t>
-            </w:r>
-          </w:p>
-        </w:tc>
-        <w:tc>
-          <w:p>
-            <w:r>
-              <w:rPr>
-                <w:rFonts w:ascii="Aptos" w:cs="Aptos" w:eastAsia="Aptos" w:hAnsi="Aptos"/>
-                <w:sz w:val="20"/>
-                <w:szCs w:val="20"/>
-              </w:rPr>
-              <w:t xml:space="preserve">Yes</w:t>
-            </w:r>
-          </w:p>
-        </w:tc>
-        <w:tc>
-          <w:p>
-            <w:r>
-              <w:rPr>
-                <w:rFonts w:ascii="Aptos" w:cs="Aptos" w:eastAsia="Aptos" w:hAnsi="Aptos"/>
-                <w:sz w:val="20"/>
-                <w:szCs w:val="20"/>
-              </w:rPr>
-              <w:t xml:space="preserve">POPIA compliance and regulatory management with consent tracking and tabbed views</w:t>
             </w:r>
           </w:p>
         </w:tc>
@@ -5669,7 +6334,7 @@
         <w:spacing w:after="120" w:before="300"/>
       </w:pPr>
       <w:r>
-        <w:t xml:space="preserve">5.2 Dashboard Features</w:t>
+        <w:t xml:space="preserve">5.3 Dashboard Features</w:t>
       </w:r>
     </w:p>
     <w:p>
@@ -5773,7 +6438,7 @@
         <w:spacing w:after="120" w:before="300"/>
       </w:pPr>
       <w:r>
-        <w:t xml:space="preserve">5.3 Lead Management</w:t>
+        <w:t xml:space="preserve">5.4 Lead Management</w:t>
       </w:r>
     </w:p>
     <w:p>
@@ -5913,7 +6578,7 @@
         <w:spacing w:after="120" w:before="300"/>
       </w:pPr>
       <w:r>
-        <w:t xml:space="preserve">5.4 Contact Management</w:t>
+        <w:t xml:space="preserve">5.5 Contact Management</w:t>
       </w:r>
     </w:p>
     <w:p>
@@ -5999,7 +6664,7 @@
         <w:spacing w:after="120" w:before="300"/>
       </w:pPr>
       <w:r>
-        <w:t xml:space="preserve">5.5 Pipeline Visualisation</w:t>
+        <w:t xml:space="preserve">5.6 Pipeline Visualisation</w:t>
       </w:r>
     </w:p>
     <w:p>
@@ -6085,7 +6750,7 @@
         <w:spacing w:after="120" w:before="300"/>
       </w:pPr>
       <w:r>
-        <w:t xml:space="preserve">5.6 Task Management</w:t>
+        <w:t xml:space="preserve">5.7 Task Management</w:t>
       </w:r>
     </w:p>
     <w:p>
@@ -6189,7 +6854,7 @@
         <w:spacing w:after="120" w:before="300"/>
       </w:pPr>
       <w:r>
-        <w:t xml:space="preserve">5.7 Reports &amp; Analytics</w:t>
+        <w:t xml:space="preserve">5.8 Reports &amp; Analytics</w:t>
       </w:r>
     </w:p>
     <w:p>
@@ -6275,7 +6940,7 @@
         <w:spacing w:after="120" w:before="300"/>
       </w:pPr>
       <w:r>
-        <w:t xml:space="preserve">5.8 Property Management</w:t>
+        <w:t xml:space="preserve">5.9 Property Management</w:t>
       </w:r>
     </w:p>
     <w:p>
@@ -6361,7 +7026,7 @@
         <w:spacing w:after="120" w:before="300"/>
       </w:pPr>
       <w:r>
-        <w:t xml:space="preserve">5.9 Show Day Management</w:t>
+        <w:t xml:space="preserve">5.10 Show Day Management</w:t>
       </w:r>
     </w:p>
     <w:p>
@@ -6447,7 +7112,7 @@
         <w:spacing w:after="120" w:before="300"/>
       </w:pPr>
       <w:r>
-        <w:t xml:space="preserve">5.10 Inbound Lead Portal</w:t>
+        <w:t xml:space="preserve">5.11 Inbound Lead Portal</w:t>
       </w:r>
     </w:p>
     <w:p>
@@ -6515,7 +7180,7 @@
         <w:spacing w:after="120" w:before="300"/>
       </w:pPr>
       <w:r>
-        <w:t xml:space="preserve">5.11 Messaging Hub</w:t>
+        <w:t xml:space="preserve">5.12 Messaging Hub</w:t>
       </w:r>
     </w:p>
     <w:p>
@@ -6583,7 +7248,7 @@
         <w:spacing w:after="120" w:before="300"/>
       </w:pPr>
       <w:r>
-        <w:t xml:space="preserve">5.12 Follow-up Sequences</w:t>
+        <w:t xml:space="preserve">5.13 Follow-up Sequences</w:t>
       </w:r>
     </w:p>
     <w:p>
@@ -6669,7 +7334,7 @@
         <w:spacing w:after="120" w:before="300"/>
       </w:pPr>
       <w:r>
-        <w:t xml:space="preserve">5.13 Speed-to-Lead</w:t>
+        <w:t xml:space="preserve">5.14 Speed-to-Lead</w:t>
       </w:r>
     </w:p>
     <w:p>
@@ -6737,7 +7402,7 @@
         <w:spacing w:after="120" w:before="300"/>
       </w:pPr>
       <w:r>
-        <w:t xml:space="preserve">5.14 Buyer-Property Matching</w:t>
+        <w:t xml:space="preserve">5.15 Buyer-Property Matching</w:t>
       </w:r>
     </w:p>
     <w:p>
@@ -6805,7 +7470,7 @@
         <w:spacing w:after="120" w:before="300"/>
       </w:pPr>
       <w:r>
-        <w:t xml:space="preserve">5.15 Document Management</w:t>
+        <w:t xml:space="preserve">5.16 Document Management</w:t>
       </w:r>
     </w:p>
     <w:p>
@@ -6873,7 +7538,7 @@
         <w:spacing w:after="120" w:before="300"/>
       </w:pPr>
       <w:r>
-        <w:t xml:space="preserve">5.16 Lead Source ROI</w:t>
+        <w:t xml:space="preserve">5.17 Lead Source ROI</w:t>
       </w:r>
     </w:p>
     <w:p>
@@ -6941,7 +7606,7 @@
         <w:spacing w:after="120" w:before="300"/>
       </w:pPr>
       <w:r>
-        <w:t xml:space="preserve">5.17 Compliance</w:t>
+        <w:t xml:space="preserve">5.18 Compliance</w:t>
       </w:r>
     </w:p>
     <w:p>

</xml_diff>